<commit_message>
Update the French recap (docx, pptx): 579 checks, KYC four-eyes fix
Ten suites instead of eight (KYC approval, mandatory staff 2FA), three
fixes found by the tests instead of two, thirteen deliberate faults all
detected, and the mandatory 2FA no longer listed as untested. Pending
decisions gain keeping at least one independent KYC approver.

Co-Authored-By: Claude Opus 5.5 <noreply@anthropic.com>
Claude-Session: https://claude.ai/code/session_01ALCBMQrSwdEMnX9x1hQAFX
</commit_message>
<xml_diff>
--- a/outputs/recap/MIPS-recapitulatif.docx
+++ b/outputs/recap/MIPS-recapitulatif.docx
@@ -73,7 +73,7 @@
           <w:bCs/>
           <w:color w:val="12233A"/>
         </w:rPr>
-        <w:t xml:space="preserve">9 modules · 36 écrans capturés · 6 specs développeur · 478 vérifications automatiques</w:t>
+        <w:t xml:space="preserve">9 modules · 36 écrans capturés · 6 specs développeur · 579 vérifications automatiques</w:t>
       </w:r>
     </w:p>
     <w:p>
@@ -4790,7 +4790,7 @@
         <w:spacing w:after="120"/>
       </w:pPr>
       <w:r>
-        <w:t xml:space="preserve">Huit suites pilotent l'application par son API sur une base jetable, avec des données uniquement fictives. Les montants attendus sont calculés à la main à partir des fichiers de test. Une commande : tests/run_tests.sh.</w:t>
+        <w:t xml:space="preserve">Dix suites pilotent l'application par son API sur une base jetable, avec des données uniquement fictives. Les montants attendus sont calculés à la main à partir des fichiers de test. Une commande : tests/run_tests.sh.</w:t>
       </w:r>
     </w:p>
     <w:tbl>
@@ -5111,7 +5111,7 @@
                 <w:sz w:val="19"/>
                 <w:szCs w:val="19"/>
               </w:rPr>
-              <w:t xml:space="preserve">Reporting</w:t>
+              <w:t xml:space="preserve">Approbation KYC</w:t>
             </w:r>
           </w:p>
         </w:tc>
@@ -5139,7 +5139,7 @@
                 <w:sz w:val="19"/>
                 <w:szCs w:val="19"/>
               </w:rPr>
-              <w:t xml:space="preserve">Règles de nettoyage, lignes du rapport, tendances, exports, réimport</w:t>
+              <w:t xml:space="preserve">Chacun des blocages, rôle d'approbateur, double regard sur la décision, note, revue périodique</w:t>
             </w:r>
           </w:p>
         </w:tc>
@@ -5167,7 +5167,7 @@
                 <w:sz w:val="19"/>
                 <w:szCs w:val="19"/>
               </w:rPr>
-              <w:t xml:space="preserve">65</w:t>
+              <w:t xml:space="preserve">78</w:t>
             </w:r>
           </w:p>
         </w:tc>
@@ -5200,7 +5200,7 @@
                 <w:sz w:val="19"/>
                 <w:szCs w:val="19"/>
               </w:rPr>
-              <w:t xml:space="preserve">Facturation</w:t>
+              <w:t xml:space="preserve">Reporting</w:t>
             </w:r>
           </w:p>
         </w:tc>
@@ -5228,7 +5228,7 @@
                 <w:sz w:val="19"/>
                 <w:szCs w:val="19"/>
               </w:rPr>
-              <w:t xml:space="preserve">Priorité des règles, TVA, cycle des factures, numérotation, mois verrouillé</w:t>
+              <w:t xml:space="preserve">Règles de nettoyage, lignes du rapport, tendances, exports, réimport</w:t>
             </w:r>
           </w:p>
         </w:tc>
@@ -5256,7 +5256,7 @@
                 <w:sz w:val="19"/>
                 <w:szCs w:val="19"/>
               </w:rPr>
-              <w:t xml:space="preserve">47</w:t>
+              <w:t xml:space="preserve">65</w:t>
             </w:r>
           </w:p>
         </w:tc>
@@ -5289,7 +5289,7 @@
                 <w:sz w:val="19"/>
                 <w:szCs w:val="19"/>
               </w:rPr>
-              <w:t xml:space="preserve">Rapprochement MCB</w:t>
+              <w:t xml:space="preserve">Facturation</w:t>
             </w:r>
           </w:p>
         </w:tc>
@@ -5317,7 +5317,7 @@
                 <w:sz w:val="19"/>
                 <w:szCs w:val="19"/>
               </w:rPr>
-              <w:t xml:space="preserve">Six catégories d'écart au centime, règle de signe, alertes de périmètre, réclamations</w:t>
+              <w:t xml:space="preserve">Priorité des règles, TVA, cycle des factures, numérotation, mois verrouillé</w:t>
             </w:r>
           </w:p>
         </w:tc>
@@ -5345,7 +5345,7 @@
                 <w:sz w:val="19"/>
                 <w:szCs w:val="19"/>
               </w:rPr>
-              <w:t xml:space="preserve">55</w:t>
+              <w:t xml:space="preserve">47</w:t>
             </w:r>
           </w:p>
         </w:tc>
@@ -5378,7 +5378,7 @@
                 <w:sz w:val="19"/>
                 <w:szCs w:val="19"/>
               </w:rPr>
-              <w:t xml:space="preserve">BigQuery</w:t>
+              <w:t xml:space="preserve">Rapprochement MCB</w:t>
             </w:r>
           </w:p>
         </w:tc>
@@ -5406,7 +5406,7 @@
                 <w:sz w:val="19"/>
                 <w:szCs w:val="19"/>
               </w:rPr>
-              <w:t xml:space="preserve">Émulateur local : jeton signé, requête paramétrée, pagination, heure de Maurice</w:t>
+              <w:t xml:space="preserve">Six catégories d'écart au centime, règle de signe, alertes de périmètre, réclamations</w:t>
             </w:r>
           </w:p>
         </w:tc>
@@ -5434,7 +5434,7 @@
                 <w:sz w:val="19"/>
                 <w:szCs w:val="19"/>
               </w:rPr>
-              <w:t xml:space="preserve">23</w:t>
+              <w:t xml:space="preserve">55</w:t>
             </w:r>
           </w:p>
         </w:tc>
@@ -5467,6 +5467,95 @@
                 <w:sz w:val="19"/>
                 <w:szCs w:val="19"/>
               </w:rPr>
+              <w:t xml:space="preserve">BigQuery</w:t>
+            </w:r>
+          </w:p>
+        </w:tc>
+        <w:tc>
+          <w:tcPr>
+            <w:tcW w:type="dxa" w:w="6038"/>
+            <w:tcBorders>
+              <w:top w:val="single" w:color="D5DDE7" w:sz="4"/>
+              <w:left w:val="single" w:color="D5DDE7" w:sz="4"/>
+              <w:bottom w:val="single" w:color="D5DDE7" w:sz="4"/>
+              <w:right w:val="single" w:color="D5DDE7" w:sz="4"/>
+            </w:tcBorders>
+            <w:tcMar>
+              <w:top w:type="dxa" w:w="60"/>
+              <w:left w:type="dxa" w:w="100"/>
+              <w:bottom w:type="dxa" w:w="60"/>
+              <w:right w:type="dxa" w:w="100"/>
+            </w:tcMar>
+          </w:tcPr>
+          <w:p>
+            <w:r>
+              <w:rPr>
+                <w:b w:val="false"/>
+                <w:bCs w:val="false"/>
+                <w:sz w:val="19"/>
+                <w:szCs w:val="19"/>
+              </w:rPr>
+              <w:t xml:space="preserve">Émulateur local : jeton signé, requête paramétrée, pagination, heure de Maurice</w:t>
+            </w:r>
+          </w:p>
+        </w:tc>
+        <w:tc>
+          <w:tcPr>
+            <w:tcW w:type="dxa" w:w="1200"/>
+            <w:tcBorders>
+              <w:top w:val="single" w:color="D5DDE7" w:sz="4"/>
+              <w:left w:val="single" w:color="D5DDE7" w:sz="4"/>
+              <w:bottom w:val="single" w:color="D5DDE7" w:sz="4"/>
+              <w:right w:val="single" w:color="D5DDE7" w:sz="4"/>
+            </w:tcBorders>
+            <w:tcMar>
+              <w:top w:type="dxa" w:w="60"/>
+              <w:left w:type="dxa" w:w="100"/>
+              <w:bottom w:type="dxa" w:w="60"/>
+              <w:right w:type="dxa" w:w="100"/>
+            </w:tcMar>
+          </w:tcPr>
+          <w:p>
+            <w:r>
+              <w:rPr>
+                <w:b w:val="false"/>
+                <w:bCs w:val="false"/>
+                <w:sz w:val="19"/>
+                <w:szCs w:val="19"/>
+              </w:rPr>
+              <w:t xml:space="preserve">23</w:t>
+            </w:r>
+          </w:p>
+        </w:tc>
+      </w:tr>
+      <w:tr>
+        <w:trPr>
+          <w:cantSplit/>
+        </w:trPr>
+        <w:tc>
+          <w:tcPr>
+            <w:tcW w:type="dxa" w:w="2400"/>
+            <w:tcBorders>
+              <w:top w:val="single" w:color="D5DDE7" w:sz="4"/>
+              <w:left w:val="single" w:color="D5DDE7" w:sz="4"/>
+              <w:bottom w:val="single" w:color="D5DDE7" w:sz="4"/>
+              <w:right w:val="single" w:color="D5DDE7" w:sz="4"/>
+            </w:tcBorders>
+            <w:tcMar>
+              <w:top w:type="dxa" w:w="60"/>
+              <w:left w:type="dxa" w:w="100"/>
+              <w:bottom w:type="dxa" w:w="60"/>
+              <w:right w:type="dxa" w:w="100"/>
+            </w:tcMar>
+          </w:tcPr>
+          <w:p>
+            <w:r>
+              <w:rPr>
+                <w:b w:val="false"/>
+                <w:bCs w:val="false"/>
+                <w:sz w:val="19"/>
+                <w:szCs w:val="19"/>
+              </w:rPr>
               <w:t xml:space="preserve">Fiches marchands</w:t>
             </w:r>
           </w:p>
@@ -5524,6 +5613,95 @@
                 <w:szCs w:val="19"/>
               </w:rPr>
               <w:t xml:space="preserve">71</w:t>
+            </w:r>
+          </w:p>
+        </w:tc>
+      </w:tr>
+      <w:tr>
+        <w:trPr>
+          <w:cantSplit/>
+        </w:trPr>
+        <w:tc>
+          <w:tcPr>
+            <w:tcW w:type="dxa" w:w="2400"/>
+            <w:tcBorders>
+              <w:top w:val="single" w:color="D5DDE7" w:sz="4"/>
+              <w:left w:val="single" w:color="D5DDE7" w:sz="4"/>
+              <w:bottom w:val="single" w:color="D5DDE7" w:sz="4"/>
+              <w:right w:val="single" w:color="D5DDE7" w:sz="4"/>
+            </w:tcBorders>
+            <w:tcMar>
+              <w:top w:type="dxa" w:w="60"/>
+              <w:left w:type="dxa" w:w="100"/>
+              <w:bottom w:type="dxa" w:w="60"/>
+              <w:right w:type="dxa" w:w="100"/>
+            </w:tcMar>
+          </w:tcPr>
+          <w:p>
+            <w:r>
+              <w:rPr>
+                <w:b w:val="false"/>
+                <w:bCs w:val="false"/>
+                <w:sz w:val="19"/>
+                <w:szCs w:val="19"/>
+              </w:rPr>
+              <w:t xml:space="preserve">2FA obligatoire</w:t>
+            </w:r>
+          </w:p>
+        </w:tc>
+        <w:tc>
+          <w:tcPr>
+            <w:tcW w:type="dxa" w:w="6038"/>
+            <w:tcBorders>
+              <w:top w:val="single" w:color="D5DDE7" w:sz="4"/>
+              <w:left w:val="single" w:color="D5DDE7" w:sz="4"/>
+              <w:bottom w:val="single" w:color="D5DDE7" w:sz="4"/>
+              <w:right w:val="single" w:color="D5DDE7" w:sz="4"/>
+            </w:tcBorders>
+            <w:tcMar>
+              <w:top w:type="dxa" w:w="60"/>
+              <w:left w:type="dxa" w:w="100"/>
+              <w:bottom w:type="dxa" w:w="60"/>
+              <w:right w:type="dxa" w:w="100"/>
+            </w:tcMar>
+          </w:tcPr>
+          <w:p>
+            <w:r>
+              <w:rPr>
+                <w:b w:val="false"/>
+                <w:bCs w:val="false"/>
+                <w:sz w:val="19"/>
+                <w:szCs w:val="19"/>
+              </w:rPr>
+              <w:t xml:space="preserve">Admin et finance : modules fermés sans 2FA, désactivation refusée, nouvel enrôlement après remise à zéro</w:t>
+            </w:r>
+          </w:p>
+        </w:tc>
+        <w:tc>
+          <w:tcPr>
+            <w:tcW w:type="dxa" w:w="1200"/>
+            <w:tcBorders>
+              <w:top w:val="single" w:color="D5DDE7" w:sz="4"/>
+              <w:left w:val="single" w:color="D5DDE7" w:sz="4"/>
+              <w:bottom w:val="single" w:color="D5DDE7" w:sz="4"/>
+              <w:right w:val="single" w:color="D5DDE7" w:sz="4"/>
+            </w:tcBorders>
+            <w:tcMar>
+              <w:top w:type="dxa" w:w="60"/>
+              <w:left w:type="dxa" w:w="100"/>
+              <w:bottom w:type="dxa" w:w="60"/>
+              <w:right w:type="dxa" w:w="100"/>
+            </w:tcMar>
+          </w:tcPr>
+          <w:p>
+            <w:r>
+              <w:rPr>
+                <w:b w:val="false"/>
+                <w:bCs w:val="false"/>
+                <w:sz w:val="19"/>
+                <w:szCs w:val="19"/>
+              </w:rPr>
+              <w:t xml:space="preserve">23</w:t>
             </w:r>
           </w:p>
         </w:tc>
@@ -5635,7 +5813,7 @@
         <w:t xml:space="preserve">Solidité : </w:t>
       </w:r>
       <w:r>
-        <w:t xml:space="preserve">sept erreurs introduites volontairement dans le code (classement d'un rail, règle de signe du rapprochement, priorité des commissions, fuseau horaire BigQuery, propriété d'un contact, protection de l'administrateur, fermeture des sessions) sont détectées. La règle de signe ne l'était pas au premier essai : un cas de test a été ajouté.</w:t>
+        <w:t xml:space="preserve">treize erreurs introduites volontairement dans le code (classement d'un rail, règle de signe du rapprochement, priorité des commissions, fuseau horaire BigQuery, propriété d'un contact, protection de l'administrateur, fermeture des sessions, rôle d'approbateur, blocages d'approbation, note de décision, double regard, 2FA obligatoire, désactivation de la 2FA) sont détectées. La règle de signe ne l'était pas au premier essai : un cas de test a été ajouté.</w:t>
       </w:r>
     </w:p>
     <w:p>
@@ -5684,6 +5862,26 @@
       </w:r>
       <w:r>
         <w:t xml:space="preserve">deux changements dans la même seconde laissaient ouverte une session ouverte entre les deux. L'heure est désormais enregistrée à la microseconde.</w:t>
+      </w:r>
+    </w:p>
+    <w:p>
+      <w:pPr>
+        <w:pStyle w:val="ListParagraph"/>
+        <w:numPr>
+          <w:ilvl w:val="0"/>
+          <w:numId w:val="2"/>
+        </w:numPr>
+        <w:spacing w:after="60"/>
+      </w:pPr>
+      <w:r>
+        <w:rPr>
+          <w:b/>
+          <w:bCs/>
+        </w:rPr>
+        <w:t xml:space="preserve">Double regard sur l'approbation KYC : </w:t>
+      </w:r>
+      <w:r>
+        <w:t xml:space="preserve">un analyste ayant le rôle d'approbateur pouvait réassigner le dossier à un collègue puis le trancher lui-même. Désormais, personne qui a eu la main sur le dossier (créateur, analyste passé ou présent, auteur d'une réassignation) ne peut le décider.</w:t>
       </w:r>
     </w:p>
     <w:p>
@@ -5750,7 +5948,7 @@
         <w:spacing w:after="60"/>
       </w:pPr>
       <w:r>
-        <w:t xml:space="preserve">La règle « 2FA obligatoire pour admin et finance », désactivée dans la configuration de test, et les écrans.</w:t>
+        <w:t xml:space="preserve">Les écrans : les tests pilotent l'API, pas l'interface.</w:t>
       </w:r>
     </w:p>
     <w:p>
@@ -6759,6 +6957,95 @@
                 <w:szCs w:val="19"/>
               </w:rPr>
               <w:t xml:space="preserve">50 échecs en 15 minutes : choix par défaut, à confronter au trafic réel du bureau</w:t>
+            </w:r>
+          </w:p>
+        </w:tc>
+      </w:tr>
+      <w:tr>
+        <w:trPr>
+          <w:cantSplit/>
+        </w:trPr>
+        <w:tc>
+          <w:tcPr>
+            <w:tcW w:type="dxa" w:w="2000"/>
+            <w:tcBorders>
+              <w:top w:val="single" w:color="D5DDE7" w:sz="4"/>
+              <w:left w:val="single" w:color="D5DDE7" w:sz="4"/>
+              <w:bottom w:val="single" w:color="D5DDE7" w:sz="4"/>
+              <w:right w:val="single" w:color="D5DDE7" w:sz="4"/>
+            </w:tcBorders>
+            <w:tcMar>
+              <w:top w:type="dxa" w:w="60"/>
+              <w:left w:type="dxa" w:w="100"/>
+              <w:bottom w:type="dxa" w:w="60"/>
+              <w:right w:type="dxa" w:w="100"/>
+            </w:tcMar>
+          </w:tcPr>
+          <w:p>
+            <w:r>
+              <w:rPr>
+                <w:b w:val="false"/>
+                <w:bCs w:val="false"/>
+                <w:sz w:val="19"/>
+                <w:szCs w:val="19"/>
+              </w:rPr>
+              <w:t xml:space="preserve">Direction</w:t>
+            </w:r>
+          </w:p>
+        </w:tc>
+        <w:tc>
+          <w:tcPr>
+            <w:tcW w:type="dxa" w:w="3000"/>
+            <w:tcBorders>
+              <w:top w:val="single" w:color="D5DDE7" w:sz="4"/>
+              <w:left w:val="single" w:color="D5DDE7" w:sz="4"/>
+              <w:bottom w:val="single" w:color="D5DDE7" w:sz="4"/>
+              <w:right w:val="single" w:color="D5DDE7" w:sz="4"/>
+            </w:tcBorders>
+            <w:tcMar>
+              <w:top w:type="dxa" w:w="60"/>
+              <w:left w:type="dxa" w:w="100"/>
+              <w:bottom w:type="dxa" w:w="60"/>
+              <w:right w:type="dxa" w:w="100"/>
+            </w:tcMar>
+          </w:tcPr>
+          <w:p>
+            <w:r>
+              <w:rPr>
+                <w:b w:val="false"/>
+                <w:bCs w:val="false"/>
+                <w:sz w:val="19"/>
+                <w:szCs w:val="19"/>
+              </w:rPr>
+              <w:t xml:space="preserve">Approbateurs indépendants</w:t>
+            </w:r>
+          </w:p>
+        </w:tc>
+        <w:tc>
+          <w:tcPr>
+            <w:tcW w:type="dxa" w:w="4638"/>
+            <w:tcBorders>
+              <w:top w:val="single" w:color="D5DDE7" w:sz="4"/>
+              <w:left w:val="single" w:color="D5DDE7" w:sz="4"/>
+              <w:bottom w:val="single" w:color="D5DDE7" w:sz="4"/>
+              <w:right w:val="single" w:color="D5DDE7" w:sz="4"/>
+            </w:tcBorders>
+            <w:tcMar>
+              <w:top w:type="dxa" w:w="60"/>
+              <w:left w:type="dxa" w:w="100"/>
+              <w:bottom w:type="dxa" w:w="60"/>
+              <w:right w:type="dxa" w:w="100"/>
+            </w:tcMar>
+          </w:tcPr>
+          <w:p>
+            <w:r>
+              <w:rPr>
+                <w:b w:val="false"/>
+                <w:bCs w:val="false"/>
+                <w:sz w:val="19"/>
+                <w:szCs w:val="19"/>
+              </w:rPr>
+              <w:t xml:space="preserve">Qui a eu la main sur un dossier KYC ne peut pas le trancher : garder au moins un approbateur hors instruction</w:t>
             </w:r>
           </w:p>
         </w:tc>

</xml_diff>

<commit_message>
French recap (docx, pptx): 590 checks with the ClamAV antivirus suite
Eleven suites, fourteen deliberate faults detected, the antivirus
detection rate listed as not proven (test signature only), and the
antivirus decision now names ClamAV with clamd and freshclam.

Co-Authored-By: Claude Opus 5.5 <noreply@anthropic.com>
Claude-Session: https://claude.ai/code/session_01ALCBMQrSwdEMnX9x1hQAFX
</commit_message>
<xml_diff>
--- a/outputs/recap/MIPS-recapitulatif.docx
+++ b/outputs/recap/MIPS-recapitulatif.docx
@@ -73,7 +73,7 @@
           <w:bCs/>
           <w:color w:val="12233A"/>
         </w:rPr>
-        <w:t xml:space="preserve">9 modules · 36 écrans capturés · 6 specs développeur · 579 vérifications automatiques</w:t>
+        <w:t xml:space="preserve">9 modules · 36 écrans capturés · 6 specs développeur · 590 vérifications automatiques</w:t>
       </w:r>
     </w:p>
     <w:p>
@@ -4790,7 +4790,7 @@
         <w:spacing w:after="120"/>
       </w:pPr>
       <w:r>
-        <w:t xml:space="preserve">Dix suites pilotent l'application par son API sur une base jetable, avec des données uniquement fictives. Les montants attendus sont calculés à la main à partir des fichiers de test. Une commande : tests/run_tests.sh.</w:t>
+        <w:t xml:space="preserve">Onze suites pilotent l'application par son API sur une base jetable, avec des données uniquement fictives. Les montants attendus sont calculés à la main à partir des fichiers de test. Une commande : tests/run_tests.sh.</w:t>
       </w:r>
     </w:p>
     <w:tbl>
@@ -5645,6 +5645,95 @@
                 <w:sz w:val="19"/>
                 <w:szCs w:val="19"/>
               </w:rPr>
+              <w:t xml:space="preserve">Antivirus (ClamAV)</w:t>
+            </w:r>
+          </w:p>
+        </w:tc>
+        <w:tc>
+          <w:tcPr>
+            <w:tcW w:type="dxa" w:w="6038"/>
+            <w:tcBorders>
+              <w:top w:val="single" w:color="D5DDE7" w:sz="4"/>
+              <w:left w:val="single" w:color="D5DDE7" w:sz="4"/>
+              <w:bottom w:val="single" w:color="D5DDE7" w:sz="4"/>
+              <w:right w:val="single" w:color="D5DDE7" w:sz="4"/>
+            </w:tcBorders>
+            <w:tcMar>
+              <w:top w:type="dxa" w:w="60"/>
+              <w:left w:type="dxa" w:w="100"/>
+              <w:bottom w:type="dxa" w:w="60"/>
+              <w:right w:type="dxa" w:w="100"/>
+            </w:tcMar>
+          </w:tcPr>
+          <w:p>
+            <w:r>
+              <w:rPr>
+                <w:b w:val="false"/>
+                <w:bCs w:val="false"/>
+                <w:sz w:val="19"/>
+                <w:szCs w:val="19"/>
+              </w:rPr>
+              <w:t xml:space="preserve">Vrai moteur, scan direct et démon : pièce infectée refusée, refus si signatures absentes ou antivirus arrêté</w:t>
+            </w:r>
+          </w:p>
+        </w:tc>
+        <w:tc>
+          <w:tcPr>
+            <w:tcW w:type="dxa" w:w="1200"/>
+            <w:tcBorders>
+              <w:top w:val="single" w:color="D5DDE7" w:sz="4"/>
+              <w:left w:val="single" w:color="D5DDE7" w:sz="4"/>
+              <w:bottom w:val="single" w:color="D5DDE7" w:sz="4"/>
+              <w:right w:val="single" w:color="D5DDE7" w:sz="4"/>
+            </w:tcBorders>
+            <w:tcMar>
+              <w:top w:type="dxa" w:w="60"/>
+              <w:left w:type="dxa" w:w="100"/>
+              <w:bottom w:type="dxa" w:w="60"/>
+              <w:right w:type="dxa" w:w="100"/>
+            </w:tcMar>
+          </w:tcPr>
+          <w:p>
+            <w:r>
+              <w:rPr>
+                <w:b w:val="false"/>
+                <w:bCs w:val="false"/>
+                <w:sz w:val="19"/>
+                <w:szCs w:val="19"/>
+              </w:rPr>
+              <w:t xml:space="preserve">11</w:t>
+            </w:r>
+          </w:p>
+        </w:tc>
+      </w:tr>
+      <w:tr>
+        <w:trPr>
+          <w:cantSplit/>
+        </w:trPr>
+        <w:tc>
+          <w:tcPr>
+            <w:tcW w:type="dxa" w:w="2400"/>
+            <w:tcBorders>
+              <w:top w:val="single" w:color="D5DDE7" w:sz="4"/>
+              <w:left w:val="single" w:color="D5DDE7" w:sz="4"/>
+              <w:bottom w:val="single" w:color="D5DDE7" w:sz="4"/>
+              <w:right w:val="single" w:color="D5DDE7" w:sz="4"/>
+            </w:tcBorders>
+            <w:tcMar>
+              <w:top w:type="dxa" w:w="60"/>
+              <w:left w:type="dxa" w:w="100"/>
+              <w:bottom w:type="dxa" w:w="60"/>
+              <w:right w:type="dxa" w:w="100"/>
+            </w:tcMar>
+          </w:tcPr>
+          <w:p>
+            <w:r>
+              <w:rPr>
+                <w:b w:val="false"/>
+                <w:bCs w:val="false"/>
+                <w:sz w:val="19"/>
+                <w:szCs w:val="19"/>
+              </w:rPr>
               <w:t xml:space="preserve">2FA obligatoire</w:t>
             </w:r>
           </w:p>
@@ -5813,7 +5902,7 @@
         <w:t xml:space="preserve">Solidité : </w:t>
       </w:r>
       <w:r>
-        <w:t xml:space="preserve">treize erreurs introduites volontairement dans le code (classement d'un rail, règle de signe du rapprochement, priorité des commissions, fuseau horaire BigQuery, propriété d'un contact, protection de l'administrateur, fermeture des sessions, rôle d'approbateur, blocages d'approbation, note de décision, double regard, 2FA obligatoire, désactivation de la 2FA) sont détectées. La règle de signe ne l'était pas au premier essai : un cas de test a été ajouté.</w:t>
+        <w:t xml:space="preserve">quatorze erreurs introduites volontairement dans le code (classement d'un rail, règle de signe du rapprochement, priorité des commissions, fuseau horaire BigQuery, propriété d'un contact, protection de l'administrateur, fermeture des sessions, rôle d'approbateur, blocages d'approbation, note de décision, double regard, 2FA obligatoire, désactivation de la 2FA, antivirus en panne qui laisserait passer le fichier) sont détectées. La règle de signe ne l'était pas au premier essai : un cas de test a été ajouté.</w:t>
       </w:r>
     </w:p>
     <w:p>
@@ -5948,6 +6037,19 @@
         <w:spacing w:after="60"/>
       </w:pPr>
       <w:r>
+        <w:t xml:space="preserve">Le taux de détection de l'antivirus : les signatures officielles de ClamAV ne sont pas téléchargeables dans l'environnement de test, la suite utilise une signature de test (EICAR).</w:t>
+      </w:r>
+    </w:p>
+    <w:p>
+      <w:pPr>
+        <w:pStyle w:val="ListParagraph"/>
+        <w:numPr>
+          <w:ilvl w:val="0"/>
+          <w:numId w:val="2"/>
+        </w:numPr>
+        <w:spacing w:after="60"/>
+      </w:pPr>
+      <w:r>
         <w:t xml:space="preserve">Les écrans : les tests pilotent l'API, pas l'interface.</w:t>
       </w:r>
     </w:p>
@@ -6689,7 +6791,7 @@
                 <w:sz w:val="19"/>
                 <w:szCs w:val="19"/>
               </w:rPr>
-              <w:t xml:space="preserve">À installer et rendre obligatoire avant mise en service</w:t>
+              <w:t xml:space="preserve">ClamAV avec le démon clamd (testé) : installer, tenir les signatures à jour (freshclam), rendre obligatoire avant mise en service</w:t>
             </w:r>
           </w:p>
         </w:tc>

</xml_diff>

<commit_message>
French recap (docx, pptx): S04d recaptured with ClamAV
The BoM evidence table no longer says 'not scanned': S04d now shows
'antivirus OK' with the official signatures, active on the demo only.
The untested items explain why a refused infected file could not be
shown, and the antivirus decision gives the measured clamd vs clamscan
times.

Co-Authored-By: Claude Opus 5.5 <noreply@anthropic.com>
Claude-Session: https://claude.ai/code/session_01ALCBMQrSwdEMnX9x1hQAFX
</commit_message>
<xml_diff>
--- a/outputs/recap/MIPS-recapitulatif.docx
+++ b/outputs/recap/MIPS-recapitulatif.docx
@@ -3518,7 +3518,7 @@
                 <w:sz w:val="19"/>
                 <w:szCs w:val="19"/>
               </w:rPr>
-              <w:t xml:space="preserve">Pas d'antivirus installé : pièces « not scanned »</w:t>
+              <w:t xml:space="preserve">S04d recapturée avec ClamAV et les signatures officielles (« antivirus OK ») ; antivirus actif sur la démo seulement</w:t>
             </w:r>
           </w:p>
         </w:tc>
@@ -6037,7 +6037,7 @@
         <w:spacing w:after="60"/>
       </w:pPr>
       <w:r>
-        <w:t xml:space="preserve">Le taux de détection de l'antivirus : les signatures officielles de ClamAV ne sont pas téléchargeables dans l'environnement de test, la suite utilise une signature de test (EICAR).</w:t>
+        <w:t xml:space="preserve">Le taux de détection de l'antivirus : la suite utilise une signature de test (EICAR). Les signatures officielles, obtenues par le miroir Microsoft, n'ont servi qu'à la capture S04d ; elles ne détectent pas la chaîne EICAR ajoutée à un PDF, donc le refus d'une pièce infectée n'a pas pu être montré à l'écran.</w:t>
       </w:r>
     </w:p>
     <w:p>
@@ -6791,7 +6791,7 @@
                 <w:sz w:val="19"/>
                 <w:szCs w:val="19"/>
               </w:rPr>
-              <w:t xml:space="preserve">ClamAV avec le démon clamd (testé) : installer, tenir les signatures à jour (freshclam), rendre obligatoire avant mise en service</w:t>
+              <w:t xml:space="preserve">ClamAV avec le démon clamd (testé ; moins de 0,1 s par pièce contre environ 20 s avec clamscan) : installer, tenir les signatures à jour (freshclam), rendre obligatoire avant mise en service</w:t>
             </w:r>
           </w:p>
         </w:tc>

</xml_diff>

<commit_message>
Recap, developer and English BoM decks: model A chosen
French recap (docx, pptx): model A retained on 31 October, model B
not pursued, trust spec not to be developed; the blocking items are now
the licence category and the wallet / transfer flows.
Developer deck: trust module out of the roadmap, decisions updated.
English BoM draft: the fund-flow slide shows the gateway model only, with
what it means for safeguarding and a TO CONFIRM tag for the two checks;
safeguarding reconciliation marked not applicable.

Co-Authored-By: Claude Opus 5.5 <noreply@anthropic.com>
Claude-Session: https://claude.ai/code/session_01ALCBMQrSwdEMnX9x1hQAFX
</commit_message>
<xml_diff>
--- a/outputs/recap/MIPS-recapitulatif.docx
+++ b/outputs/recap/MIPS-recapitulatif.docx
@@ -183,7 +183,7 @@
       <w:r>
         <w:drawing>
           <wp:inline distT="0" distB="0" distL="0" distR="0">
-            <wp:extent cx="6096000" cy="3867150"/>
+            <wp:extent cx="6096000" cy="4086225"/>
             <wp:effectExtent t="0" r="0" b="0" l="0"/>
             <wp:docPr id="1" name="" descr="" title=""/>
             <wp:cNvGraphicFramePr>
@@ -208,7 +208,7 @@
                   <pic:spPr bwMode="auto">
                     <a:xfrm>
                       <a:off x="0" y="0"/>
-                      <a:ext cx="6096000" cy="3867150"/>
+                      <a:ext cx="6096000" cy="4086225"/>
                     </a:xfrm>
                     <a:prstGeom prst="rect">
                       <a:avLst/>
@@ -2235,7 +2235,14 @@
         <w:spacing w:after="120"/>
       </w:pPr>
       <w:r>
-        <w:t xml:space="preserve">Où va l'argent aujourd'hui, et l'option du dossier SPIN. La réconciliation trust n'a de sens que dans le modèle B ; le choix du modèle se fait avant tout développement.</w:t>
+        <w:rPr>
+          <w:b/>
+          <w:bCs/>
+        </w:rPr>
+        <w:t xml:space="preserve">Décision du 31 octobre : modèle A retenu pour le dossier SPIN. </w:t>
+      </w:r>
+      <w:r>
+        <w:t xml:space="preserve">Aucun fonds de marchand détenu, pas de module trust. Le modèle B ne sera envisagé que pour une raison commerciale claire. Deux vérifications conditionnent la décision : la licence demandée ne doit pas exiger de détenir les fonds, et aucun flux (wallets, virement) ne doit passer par un compte MIPS. Détail : outputs/decisions/2026-10-31-modele-flux-de-fonds.md.</w:t>
       </w:r>
     </w:p>
     <w:p>
@@ -2246,7 +2253,7 @@
       <w:r>
         <w:drawing>
           <wp:inline distT="0" distB="0" distL="0" distR="0">
-            <wp:extent cx="6096000" cy="2305050"/>
+            <wp:extent cx="6096000" cy="2295525"/>
             <wp:effectExtent t="0" r="0" b="0" l="0"/>
             <wp:docPr id="1" name="" descr="" title=""/>
             <wp:cNvGraphicFramePr>
@@ -2271,7 +2278,7 @@
                   <pic:spPr bwMode="auto">
                     <a:xfrm>
                       <a:off x="0" y="0"/>
-                      <a:ext cx="6096000" cy="2305050"/>
+                      <a:ext cx="6096000" cy="2295525"/>
                     </a:xfrm>
                     <a:prstGeom prst="rect">
                       <a:avLst/>
@@ -2361,7 +2368,7 @@
                 <w:sz w:val="18"/>
                 <w:szCs w:val="18"/>
               </w:rPr>
-              <w:t xml:space="preserve">A — Passerelle (actuel probable)</w:t>
+              <w:t xml:space="preserve">A — Passerelle (retenu)</w:t>
             </w:r>
           </w:p>
         </w:tc>
@@ -2391,7 +2398,7 @@
                 <w:sz w:val="18"/>
                 <w:szCs w:val="18"/>
               </w:rPr>
-              <w:t xml:space="preserve">B — Encaissement pour compte (option SPIN)</w:t>
+              <w:t xml:space="preserve">B — Encaissement pour compte (non retenu)</w:t>
             </w:r>
           </w:p>
         </w:tc>
@@ -2871,7 +2878,7 @@
           <w:b/>
           <w:bCs/>
         </w:rPr>
-        <w:t xml:space="preserve">Schéma proposé pour B : </w:t>
+        <w:t xml:space="preserve">Schéma préparé pour B, si un jour retenu : </w:t>
       </w:r>
       <w:r>
         <w:t xml:space="preserve">un trust en MUR chez MCB ; règlements acquéreurs bruts à J+1 ; reversements quotidiens nets de commission ; commission sortie le jour même ; réserve chargeback par marchand ; aucun frais bancaire sur le trust ; autres devises hors périmètre au départ.</w:t>
@@ -4108,7 +4115,7 @@
                 <w:sz w:val="19"/>
                 <w:szCs w:val="19"/>
               </w:rPr>
-              <w:t xml:space="preserve">Non construit ; dépend du modèle A ou B</w:t>
+              <w:t xml:space="preserve">Trust sans objet en modèle A ; le reste non construit</w:t>
             </w:r>
           </w:p>
         </w:tc>
@@ -4771,7 +4778,7 @@
                 <w:sz w:val="19"/>
                 <w:szCs w:val="19"/>
               </w:rPr>
-              <w:t xml:space="preserve">Sans code : à lancer seulement en modèle B</w:t>
+              <w:t xml:space="preserve">Ne pas développer : modèle A retenu le 31 octobre</w:t>
             </w:r>
           </w:p>
         </w:tc>
@@ -6201,7 +6208,7 @@
                 <w:sz w:val="19"/>
                 <w:szCs w:val="19"/>
               </w:rPr>
-              <w:t xml:space="preserve">CEO (bloquant)</w:t>
+              <w:t xml:space="preserve">Conformité (bloquant)</w:t>
             </w:r>
           </w:p>
         </w:tc>
@@ -6229,7 +6236,7 @@
                 <w:sz w:val="19"/>
                 <w:szCs w:val="19"/>
               </w:rPr>
-              <w:t xml:space="preserve">Modèle A ou B pour SPIN</w:t>
+              <w:t xml:space="preserve">Licence compatible avec le modèle A</w:t>
             </w:r>
           </w:p>
         </w:tc>
@@ -6257,7 +6264,7 @@
                 <w:sz w:val="19"/>
                 <w:szCs w:val="19"/>
               </w:rPr>
-              <w:t xml:space="preserve">Conditionne la réconciliation trust et ce qui est promis à la BoM</w:t>
+              <w:t xml:space="preserve">Modèle A retenu le 31 octobre : vérifier que la licence demandée n'exige pas de détenir les fonds des marchands</w:t>
             </w:r>
           </w:p>
         </w:tc>
@@ -6646,7 +6653,7 @@
                 <w:sz w:val="19"/>
                 <w:szCs w:val="19"/>
               </w:rPr>
-              <w:t xml:space="preserve">Finance</w:t>
+              <w:t xml:space="preserve">Finance (bloquant)</w:t>
             </w:r>
           </w:p>
         </w:tc>

</xml_diff>